<commit_message>
Build site at 2026-05-25 13:38:13 UTC
</commit_message>
<xml_diff>
--- a/_Drive/Formularios/Doutorado-FluxoContinuo/Modelo de inscrição para Doutorado-Fluxo Contínuo.docx
+++ b/_Drive/Formularios/Doutorado-FluxoContinuo/Modelo de inscrição para Doutorado-Fluxo Contínuo.docx
@@ -10,6 +10,7 @@
         <w:jc w:val="center"/>
         <w:rPr>
           <w:b w:val="1"/>
+          <w:bCs w:val="1"/>
           <w:sz w:val="28"/>
           <w:szCs w:val="28"/>
         </w:rPr>
@@ -17,6 +18,7 @@
       <w:r>
         <w:rPr>
           <w:b w:val="1"/>
+          <w:bCs w:val="1"/>
           <w:sz w:val="28"/>
           <w:szCs w:val="28"/>
           <w:rtl w:val="0"/>
@@ -55,6 +57,7 @@
         <w:rPr>
           <w:rFonts w:ascii="Times" w:cs="Times" w:eastAsia="Times" w:hAnsi="Times"/>
           <w:b w:val="1"/>
+          <w:bCs w:val="1"/>
           <w:sz w:val="20"/>
           <w:szCs w:val="20"/>
           <w:rtl w:val="0"/>
@@ -85,6 +88,7 @@
         <w:rPr>
           <w:rFonts w:ascii="Times" w:cs="Times" w:eastAsia="Times" w:hAnsi="Times"/>
           <w:b w:val="1"/>
+          <w:bCs w:val="1"/>
           <w:sz w:val="20"/>
           <w:szCs w:val="20"/>
           <w:rtl w:val="0"/>
@@ -160,6 +164,7 @@
               <w:rPr>
                 <w:rFonts w:ascii="Times" w:cs="Times" w:eastAsia="Times" w:hAnsi="Times"/>
                 <w:b w:val="1"/>
+                <w:bCs w:val="1"/>
                 <w:sz w:val="20"/>
                 <w:szCs w:val="20"/>
                 <w:rtl w:val="0"/>
@@ -212,6 +217,7 @@
               <w:rPr>
                 <w:rFonts w:ascii="Times" w:cs="Times" w:eastAsia="Times" w:hAnsi="Times"/>
                 <w:b w:val="1"/>
+                <w:bCs w:val="1"/>
                 <w:sz w:val="20"/>
                 <w:szCs w:val="20"/>
                 <w:rtl w:val="0"/>
@@ -257,6 +263,7 @@
               <w:rPr>
                 <w:rFonts w:ascii="Times" w:cs="Times" w:eastAsia="Times" w:hAnsi="Times"/>
                 <w:b w:val="1"/>
+                <w:bCs w:val="1"/>
                 <w:sz w:val="20"/>
                 <w:szCs w:val="20"/>
                 <w:rtl w:val="0"/>
@@ -312,6 +319,7 @@
               <w:rPr>
                 <w:rFonts w:ascii="Times" w:cs="Times" w:eastAsia="Times" w:hAnsi="Times"/>
                 <w:b w:val="1"/>
+                <w:bCs w:val="1"/>
                 <w:sz w:val="20"/>
                 <w:szCs w:val="20"/>
                 <w:rtl w:val="0"/>
@@ -374,6 +382,7 @@
               <w:rPr>
                 <w:rFonts w:ascii="Times" w:cs="Times" w:eastAsia="Times" w:hAnsi="Times"/>
                 <w:b w:val="1"/>
+                <w:bCs w:val="1"/>
                 <w:sz w:val="20"/>
                 <w:szCs w:val="20"/>
                 <w:rtl w:val="0"/>
@@ -430,6 +439,7 @@
               <w:rPr>
                 <w:rFonts w:ascii="Times" w:cs="Times" w:eastAsia="Times" w:hAnsi="Times"/>
                 <w:b w:val="1"/>
+                <w:bCs w:val="1"/>
                 <w:sz w:val="20"/>
                 <w:szCs w:val="20"/>
                 <w:rtl w:val="0"/>
@@ -483,6 +493,7 @@
               <w:rPr>
                 <w:rFonts w:ascii="Times" w:cs="Times" w:eastAsia="Times" w:hAnsi="Times"/>
                 <w:b w:val="1"/>
+                <w:bCs w:val="1"/>
                 <w:sz w:val="20"/>
                 <w:szCs w:val="20"/>
                 <w:rtl w:val="0"/>
@@ -528,6 +539,7 @@
               <w:rPr>
                 <w:rFonts w:ascii="Times" w:cs="Times" w:eastAsia="Times" w:hAnsi="Times"/>
                 <w:b w:val="1"/>
+                <w:bCs w:val="1"/>
                 <w:sz w:val="20"/>
                 <w:szCs w:val="20"/>
                 <w:rtl w:val="0"/>
@@ -580,6 +592,7 @@
               <w:rPr>
                 <w:rFonts w:ascii="Times" w:cs="Times" w:eastAsia="Times" w:hAnsi="Times"/>
                 <w:b w:val="1"/>
+                <w:bCs w:val="1"/>
                 <w:sz w:val="20"/>
                 <w:szCs w:val="20"/>
                 <w:rtl w:val="0"/>
@@ -625,6 +638,7 @@
               <w:rPr>
                 <w:rFonts w:ascii="Times" w:cs="Times" w:eastAsia="Times" w:hAnsi="Times"/>
                 <w:b w:val="1"/>
+                <w:bCs w:val="1"/>
                 <w:sz w:val="20"/>
                 <w:szCs w:val="20"/>
                 <w:rtl w:val="0"/>
@@ -670,6 +684,7 @@
               <w:rPr>
                 <w:rFonts w:ascii="Times" w:cs="Times" w:eastAsia="Times" w:hAnsi="Times"/>
                 <w:b w:val="1"/>
+                <w:bCs w:val="1"/>
                 <w:sz w:val="20"/>
                 <w:szCs w:val="20"/>
                 <w:rtl w:val="0"/>
@@ -722,6 +737,7 @@
               <w:rPr>
                 <w:rFonts w:ascii="Times" w:cs="Times" w:eastAsia="Times" w:hAnsi="Times"/>
                 <w:b w:val="1"/>
+                <w:bCs w:val="1"/>
                 <w:sz w:val="20"/>
                 <w:szCs w:val="20"/>
                 <w:rtl w:val="0"/>
@@ -777,6 +793,7 @@
               <w:rPr>
                 <w:rFonts w:ascii="Times" w:cs="Times" w:eastAsia="Times" w:hAnsi="Times"/>
                 <w:b w:val="1"/>
+                <w:bCs w:val="1"/>
                 <w:sz w:val="20"/>
                 <w:szCs w:val="20"/>
                 <w:rtl w:val="0"/>
@@ -830,6 +847,7 @@
               <w:rPr>
                 <w:rFonts w:ascii="Times" w:cs="Times" w:eastAsia="Times" w:hAnsi="Times"/>
                 <w:b w:val="1"/>
+                <w:bCs w:val="1"/>
                 <w:sz w:val="20"/>
                 <w:szCs w:val="20"/>
                 <w:rtl w:val="0"/>
@@ -875,6 +893,7 @@
               <w:rPr>
                 <w:rFonts w:ascii="Times" w:cs="Times" w:eastAsia="Times" w:hAnsi="Times"/>
                 <w:b w:val="1"/>
+                <w:bCs w:val="1"/>
                 <w:sz w:val="20"/>
                 <w:szCs w:val="20"/>
                 <w:rtl w:val="0"/>
@@ -928,6 +947,7 @@
               <w:rPr>
                 <w:rFonts w:ascii="Times" w:cs="Times" w:eastAsia="Times" w:hAnsi="Times"/>
                 <w:b w:val="1"/>
+                <w:bCs w:val="1"/>
                 <w:sz w:val="20"/>
                 <w:szCs w:val="20"/>
                 <w:rtl w:val="0"/>
@@ -981,6 +1001,7 @@
               <w:rPr>
                 <w:rFonts w:ascii="Times" w:cs="Times" w:eastAsia="Times" w:hAnsi="Times"/>
                 <w:b w:val="1"/>
+                <w:bCs w:val="1"/>
                 <w:sz w:val="20"/>
                 <w:szCs w:val="20"/>
                 <w:rtl w:val="0"/>
@@ -1026,6 +1047,7 @@
               <w:rPr>
                 <w:rFonts w:ascii="Times" w:cs="Times" w:eastAsia="Times" w:hAnsi="Times"/>
                 <w:b w:val="1"/>
+                <w:bCs w:val="1"/>
                 <w:sz w:val="20"/>
                 <w:szCs w:val="20"/>
                 <w:rtl w:val="0"/>
@@ -1078,6 +1100,7 @@
               <w:rPr>
                 <w:rFonts w:ascii="Times" w:cs="Times" w:eastAsia="Times" w:hAnsi="Times"/>
                 <w:b w:val="1"/>
+                <w:bCs w:val="1"/>
                 <w:sz w:val="20"/>
                 <w:szCs w:val="20"/>
                 <w:rtl w:val="0"/>
@@ -1123,6 +1146,7 @@
               <w:rPr>
                 <w:rFonts w:ascii="Times" w:cs="Times" w:eastAsia="Times" w:hAnsi="Times"/>
                 <w:b w:val="1"/>
+                <w:bCs w:val="1"/>
                 <w:sz w:val="20"/>
                 <w:szCs w:val="20"/>
                 <w:rtl w:val="0"/>
@@ -1168,6 +1192,7 @@
               <w:rPr>
                 <w:rFonts w:ascii="Times" w:cs="Times" w:eastAsia="Times" w:hAnsi="Times"/>
                 <w:b w:val="1"/>
+                <w:bCs w:val="1"/>
                 <w:sz w:val="20"/>
                 <w:szCs w:val="20"/>
                 <w:rtl w:val="0"/>
@@ -1219,6 +1244,7 @@
         <w:rPr>
           <w:rFonts w:ascii="Times" w:cs="Times" w:eastAsia="Times" w:hAnsi="Times"/>
           <w:b w:val="1"/>
+          <w:bCs w:val="1"/>
           <w:sz w:val="20"/>
           <w:szCs w:val="20"/>
           <w:rtl w:val="0"/>
@@ -1304,6 +1330,7 @@
               <w:rPr>
                 <w:rFonts w:ascii="Times" w:cs="Times" w:eastAsia="Times" w:hAnsi="Times"/>
                 <w:b w:val="1"/>
+                <w:bCs w:val="1"/>
                 <w:sz w:val="20"/>
                 <w:szCs w:val="20"/>
                 <w:rtl w:val="0"/>
@@ -1367,6 +1394,7 @@
               <w:rPr>
                 <w:rFonts w:ascii="Times" w:cs="Times" w:eastAsia="Times" w:hAnsi="Times"/>
                 <w:b w:val="1"/>
+                <w:bCs w:val="1"/>
                 <w:sz w:val="20"/>
                 <w:szCs w:val="20"/>
                 <w:rtl w:val="0"/>
@@ -1430,6 +1458,7 @@
               <w:rPr>
                 <w:rFonts w:ascii="Times" w:cs="Times" w:eastAsia="Times" w:hAnsi="Times"/>
                 <w:b w:val="1"/>
+                <w:bCs w:val="1"/>
                 <w:sz w:val="20"/>
                 <w:szCs w:val="20"/>
                 <w:rtl w:val="0"/>
@@ -1493,6 +1522,7 @@
               <w:rPr>
                 <w:rFonts w:ascii="Times" w:cs="Times" w:eastAsia="Times" w:hAnsi="Times"/>
                 <w:b w:val="1"/>
+                <w:bCs w:val="1"/>
                 <w:sz w:val="20"/>
                 <w:szCs w:val="20"/>
                 <w:rtl w:val="0"/>
@@ -1548,6 +1578,7 @@
               <w:rPr>
                 <w:rFonts w:ascii="Times" w:cs="Times" w:eastAsia="Times" w:hAnsi="Times"/>
                 <w:b w:val="1"/>
+                <w:bCs w:val="1"/>
                 <w:sz w:val="20"/>
                 <w:szCs w:val="20"/>
                 <w:rtl w:val="0"/>
@@ -1609,6 +1640,7 @@
               <w:rPr>
                 <w:rFonts w:ascii="Times" w:cs="Times" w:eastAsia="Times" w:hAnsi="Times"/>
                 <w:b w:val="1"/>
+                <w:bCs w:val="1"/>
                 <w:sz w:val="20"/>
                 <w:szCs w:val="20"/>
                 <w:rtl w:val="0"/>
@@ -1664,6 +1696,7 @@
               <w:rPr>
                 <w:rFonts w:ascii="Times" w:cs="Times" w:eastAsia="Times" w:hAnsi="Times"/>
                 <w:b w:val="1"/>
+                <w:bCs w:val="1"/>
                 <w:sz w:val="20"/>
                 <w:szCs w:val="20"/>
                 <w:rtl w:val="0"/>
@@ -1719,6 +1752,7 @@
               <w:rPr>
                 <w:rFonts w:ascii="Times" w:cs="Times" w:eastAsia="Times" w:hAnsi="Times"/>
                 <w:b w:val="1"/>
+                <w:bCs w:val="1"/>
                 <w:sz w:val="20"/>
                 <w:szCs w:val="20"/>
                 <w:rtl w:val="0"/>
@@ -1775,6 +1809,7 @@
         <w:rPr>
           <w:rFonts w:ascii="Times" w:cs="Times" w:eastAsia="Times" w:hAnsi="Times"/>
           <w:b w:val="1"/>
+          <w:bCs w:val="1"/>
           <w:sz w:val="20"/>
           <w:szCs w:val="20"/>
           <w:rtl w:val="0"/>
@@ -1853,14 +1888,16 @@
               <w:rPr>
                 <w:rFonts w:ascii="Times" w:cs="Times" w:eastAsia="Times" w:hAnsi="Times"/>
                 <w:b w:val="1"/>
-                <w:sz w:val="20"/>
-                <w:szCs w:val="20"/>
-              </w:rPr>
-            </w:pPr>
-            <w:r>
-              <w:rPr>
-                <w:rFonts w:ascii="Times" w:cs="Times" w:eastAsia="Times" w:hAnsi="Times"/>
-                <w:b w:val="1"/>
+                <w:bCs w:val="1"/>
+                <w:sz w:val="20"/>
+                <w:szCs w:val="20"/>
+              </w:rPr>
+            </w:pPr>
+            <w:r>
+              <w:rPr>
+                <w:rFonts w:ascii="Times" w:cs="Times" w:eastAsia="Times" w:hAnsi="Times"/>
+                <w:b w:val="1"/>
+                <w:bCs w:val="1"/>
                 <w:sz w:val="20"/>
                 <w:szCs w:val="20"/>
                 <w:rtl w:val="0"/>
@@ -1900,14 +1937,16 @@
               <w:rPr>
                 <w:rFonts w:ascii="Times" w:cs="Times" w:eastAsia="Times" w:hAnsi="Times"/>
                 <w:b w:val="1"/>
-                <w:sz w:val="20"/>
-                <w:szCs w:val="20"/>
-              </w:rPr>
-            </w:pPr>
-            <w:r>
-              <w:rPr>
-                <w:rFonts w:ascii="Times" w:cs="Times" w:eastAsia="Times" w:hAnsi="Times"/>
-                <w:b w:val="1"/>
+                <w:bCs w:val="1"/>
+                <w:sz w:val="20"/>
+                <w:szCs w:val="20"/>
+              </w:rPr>
+            </w:pPr>
+            <w:r>
+              <w:rPr>
+                <w:rFonts w:ascii="Times" w:cs="Times" w:eastAsia="Times" w:hAnsi="Times"/>
+                <w:b w:val="1"/>
+                <w:bCs w:val="1"/>
                 <w:sz w:val="20"/>
                 <w:szCs w:val="20"/>
                 <w:rtl w:val="0"/>
@@ -1947,14 +1986,16 @@
               <w:rPr>
                 <w:rFonts w:ascii="Times" w:cs="Times" w:eastAsia="Times" w:hAnsi="Times"/>
                 <w:b w:val="1"/>
-                <w:sz w:val="20"/>
-                <w:szCs w:val="20"/>
-              </w:rPr>
-            </w:pPr>
-            <w:r>
-              <w:rPr>
-                <w:rFonts w:ascii="Times" w:cs="Times" w:eastAsia="Times" w:hAnsi="Times"/>
-                <w:b w:val="1"/>
+                <w:bCs w:val="1"/>
+                <w:sz w:val="20"/>
+                <w:szCs w:val="20"/>
+              </w:rPr>
+            </w:pPr>
+            <w:r>
+              <w:rPr>
+                <w:rFonts w:ascii="Times" w:cs="Times" w:eastAsia="Times" w:hAnsi="Times"/>
+                <w:b w:val="1"/>
+                <w:bCs w:val="1"/>
                 <w:sz w:val="20"/>
                 <w:szCs w:val="20"/>
                 <w:rtl w:val="0"/>
@@ -1994,14 +2035,16 @@
               <w:rPr>
                 <w:rFonts w:ascii="Times" w:cs="Times" w:eastAsia="Times" w:hAnsi="Times"/>
                 <w:b w:val="1"/>
-                <w:sz w:val="20"/>
-                <w:szCs w:val="20"/>
-              </w:rPr>
-            </w:pPr>
-            <w:r>
-              <w:rPr>
-                <w:rFonts w:ascii="Times" w:cs="Times" w:eastAsia="Times" w:hAnsi="Times"/>
-                <w:b w:val="1"/>
+                <w:bCs w:val="1"/>
+                <w:sz w:val="20"/>
+                <w:szCs w:val="20"/>
+              </w:rPr>
+            </w:pPr>
+            <w:r>
+              <w:rPr>
+                <w:rFonts w:ascii="Times" w:cs="Times" w:eastAsia="Times" w:hAnsi="Times"/>
+                <w:b w:val="1"/>
+                <w:bCs w:val="1"/>
                 <w:sz w:val="20"/>
                 <w:szCs w:val="20"/>
                 <w:rtl w:val="0"/>
@@ -2670,6 +2713,7 @@
         <w:rPr>
           <w:rFonts w:ascii="Times" w:cs="Times" w:eastAsia="Times" w:hAnsi="Times"/>
           <w:b w:val="1"/>
+          <w:bCs w:val="1"/>
           <w:sz w:val="20"/>
           <w:szCs w:val="20"/>
           <w:rtl w:val="0"/>
@@ -2738,14 +2782,16 @@
               <w:rPr>
                 <w:rFonts w:ascii="Times" w:cs="Times" w:eastAsia="Times" w:hAnsi="Times"/>
                 <w:b w:val="1"/>
-                <w:sz w:val="20"/>
-                <w:szCs w:val="20"/>
-              </w:rPr>
-            </w:pPr>
-            <w:r>
-              <w:rPr>
-                <w:rFonts w:ascii="Times" w:cs="Times" w:eastAsia="Times" w:hAnsi="Times"/>
-                <w:b w:val="1"/>
+                <w:bCs w:val="1"/>
+                <w:sz w:val="20"/>
+                <w:szCs w:val="20"/>
+              </w:rPr>
+            </w:pPr>
+            <w:r>
+              <w:rPr>
+                <w:rFonts w:ascii="Times" w:cs="Times" w:eastAsia="Times" w:hAnsi="Times"/>
+                <w:b w:val="1"/>
+                <w:bCs w:val="1"/>
                 <w:sz w:val="20"/>
                 <w:szCs w:val="20"/>
                 <w:rtl w:val="0"/>
@@ -2775,14 +2821,16 @@
               <w:rPr>
                 <w:rFonts w:ascii="Times" w:cs="Times" w:eastAsia="Times" w:hAnsi="Times"/>
                 <w:b w:val="1"/>
-                <w:sz w:val="20"/>
-                <w:szCs w:val="20"/>
-              </w:rPr>
-            </w:pPr>
-            <w:r>
-              <w:rPr>
-                <w:rFonts w:ascii="Times" w:cs="Times" w:eastAsia="Times" w:hAnsi="Times"/>
-                <w:b w:val="1"/>
+                <w:bCs w:val="1"/>
+                <w:sz w:val="20"/>
+                <w:szCs w:val="20"/>
+              </w:rPr>
+            </w:pPr>
+            <w:r>
+              <w:rPr>
+                <w:rFonts w:ascii="Times" w:cs="Times" w:eastAsia="Times" w:hAnsi="Times"/>
+                <w:b w:val="1"/>
+                <w:bCs w:val="1"/>
                 <w:sz w:val="20"/>
                 <w:szCs w:val="20"/>
                 <w:rtl w:val="0"/>
@@ -2812,14 +2860,16 @@
               <w:rPr>
                 <w:rFonts w:ascii="Times" w:cs="Times" w:eastAsia="Times" w:hAnsi="Times"/>
                 <w:b w:val="1"/>
-                <w:sz w:val="20"/>
-                <w:szCs w:val="20"/>
-              </w:rPr>
-            </w:pPr>
-            <w:r>
-              <w:rPr>
-                <w:rFonts w:ascii="Times" w:cs="Times" w:eastAsia="Times" w:hAnsi="Times"/>
-                <w:b w:val="1"/>
+                <w:bCs w:val="1"/>
+                <w:sz w:val="20"/>
+                <w:szCs w:val="20"/>
+              </w:rPr>
+            </w:pPr>
+            <w:r>
+              <w:rPr>
+                <w:rFonts w:ascii="Times" w:cs="Times" w:eastAsia="Times" w:hAnsi="Times"/>
+                <w:b w:val="1"/>
+                <w:bCs w:val="1"/>
                 <w:sz w:val="20"/>
                 <w:szCs w:val="20"/>
                 <w:rtl w:val="0"/>
@@ -2849,14 +2899,16 @@
               <w:rPr>
                 <w:rFonts w:ascii="Times" w:cs="Times" w:eastAsia="Times" w:hAnsi="Times"/>
                 <w:b w:val="1"/>
-                <w:sz w:val="20"/>
-                <w:szCs w:val="20"/>
-              </w:rPr>
-            </w:pPr>
-            <w:r>
-              <w:rPr>
-                <w:rFonts w:ascii="Times" w:cs="Times" w:eastAsia="Times" w:hAnsi="Times"/>
-                <w:b w:val="1"/>
+                <w:bCs w:val="1"/>
+                <w:sz w:val="20"/>
+                <w:szCs w:val="20"/>
+              </w:rPr>
+            </w:pPr>
+            <w:r>
+              <w:rPr>
+                <w:rFonts w:ascii="Times" w:cs="Times" w:eastAsia="Times" w:hAnsi="Times"/>
+                <w:b w:val="1"/>
+                <w:bCs w:val="1"/>
                 <w:sz w:val="20"/>
                 <w:szCs w:val="20"/>
                 <w:rtl w:val="0"/>
@@ -3485,6 +3537,7 @@
         <w:rPr>
           <w:rFonts w:ascii="Times" w:cs="Times" w:eastAsia="Times" w:hAnsi="Times"/>
           <w:b w:val="1"/>
+          <w:bCs w:val="1"/>
           <w:sz w:val="20"/>
           <w:szCs w:val="20"/>
           <w:rtl w:val="0"/>
@@ -3553,14 +3606,16 @@
               <w:rPr>
                 <w:rFonts w:ascii="Times" w:cs="Times" w:eastAsia="Times" w:hAnsi="Times"/>
                 <w:b w:val="1"/>
-                <w:sz w:val="20"/>
-                <w:szCs w:val="20"/>
-              </w:rPr>
-            </w:pPr>
-            <w:r>
-              <w:rPr>
-                <w:rFonts w:ascii="Times" w:cs="Times" w:eastAsia="Times" w:hAnsi="Times"/>
-                <w:b w:val="1"/>
+                <w:bCs w:val="1"/>
+                <w:sz w:val="20"/>
+                <w:szCs w:val="20"/>
+              </w:rPr>
+            </w:pPr>
+            <w:r>
+              <w:rPr>
+                <w:rFonts w:ascii="Times" w:cs="Times" w:eastAsia="Times" w:hAnsi="Times"/>
+                <w:b w:val="1"/>
+                <w:bCs w:val="1"/>
                 <w:sz w:val="20"/>
                 <w:szCs w:val="20"/>
                 <w:rtl w:val="0"/>
@@ -3590,14 +3645,16 @@
               <w:rPr>
                 <w:rFonts w:ascii="Times" w:cs="Times" w:eastAsia="Times" w:hAnsi="Times"/>
                 <w:b w:val="1"/>
-                <w:sz w:val="20"/>
-                <w:szCs w:val="20"/>
-              </w:rPr>
-            </w:pPr>
-            <w:r>
-              <w:rPr>
-                <w:rFonts w:ascii="Times" w:cs="Times" w:eastAsia="Times" w:hAnsi="Times"/>
-                <w:b w:val="1"/>
+                <w:bCs w:val="1"/>
+                <w:sz w:val="20"/>
+                <w:szCs w:val="20"/>
+              </w:rPr>
+            </w:pPr>
+            <w:r>
+              <w:rPr>
+                <w:rFonts w:ascii="Times" w:cs="Times" w:eastAsia="Times" w:hAnsi="Times"/>
+                <w:b w:val="1"/>
+                <w:bCs w:val="1"/>
                 <w:sz w:val="20"/>
                 <w:szCs w:val="20"/>
                 <w:rtl w:val="0"/>
@@ -3627,14 +3684,16 @@
               <w:rPr>
                 <w:rFonts w:ascii="Times" w:cs="Times" w:eastAsia="Times" w:hAnsi="Times"/>
                 <w:b w:val="1"/>
-                <w:sz w:val="20"/>
-                <w:szCs w:val="20"/>
-              </w:rPr>
-            </w:pPr>
-            <w:r>
-              <w:rPr>
-                <w:rFonts w:ascii="Times" w:cs="Times" w:eastAsia="Times" w:hAnsi="Times"/>
-                <w:b w:val="1"/>
+                <w:bCs w:val="1"/>
+                <w:sz w:val="20"/>
+                <w:szCs w:val="20"/>
+              </w:rPr>
+            </w:pPr>
+            <w:r>
+              <w:rPr>
+                <w:rFonts w:ascii="Times" w:cs="Times" w:eastAsia="Times" w:hAnsi="Times"/>
+                <w:b w:val="1"/>
+                <w:bCs w:val="1"/>
                 <w:sz w:val="20"/>
                 <w:szCs w:val="20"/>
                 <w:rtl w:val="0"/>
@@ -3664,14 +3723,16 @@
               <w:rPr>
                 <w:rFonts w:ascii="Times" w:cs="Times" w:eastAsia="Times" w:hAnsi="Times"/>
                 <w:b w:val="1"/>
-                <w:sz w:val="20"/>
-                <w:szCs w:val="20"/>
-              </w:rPr>
-            </w:pPr>
-            <w:r>
-              <w:rPr>
-                <w:rFonts w:ascii="Times" w:cs="Times" w:eastAsia="Times" w:hAnsi="Times"/>
-                <w:b w:val="1"/>
+                <w:bCs w:val="1"/>
+                <w:sz w:val="20"/>
+                <w:szCs w:val="20"/>
+              </w:rPr>
+            </w:pPr>
+            <w:r>
+              <w:rPr>
+                <w:rFonts w:ascii="Times" w:cs="Times" w:eastAsia="Times" w:hAnsi="Times"/>
+                <w:b w:val="1"/>
+                <w:bCs w:val="1"/>
                 <w:sz w:val="20"/>
                 <w:szCs w:val="20"/>
                 <w:rtl w:val="0"/>
@@ -4300,6 +4361,7 @@
         <w:rPr>
           <w:rFonts w:ascii="Times" w:cs="Times" w:eastAsia="Times" w:hAnsi="Times"/>
           <w:b w:val="1"/>
+          <w:bCs w:val="1"/>
           <w:sz w:val="20"/>
           <w:szCs w:val="20"/>
           <w:rtl w:val="0"/>
@@ -4368,14 +4430,16 @@
               <w:rPr>
                 <w:rFonts w:ascii="Times" w:cs="Times" w:eastAsia="Times" w:hAnsi="Times"/>
                 <w:b w:val="1"/>
-                <w:sz w:val="20"/>
-                <w:szCs w:val="20"/>
-              </w:rPr>
-            </w:pPr>
-            <w:r>
-              <w:rPr>
-                <w:rFonts w:ascii="Times" w:cs="Times" w:eastAsia="Times" w:hAnsi="Times"/>
-                <w:b w:val="1"/>
+                <w:bCs w:val="1"/>
+                <w:sz w:val="20"/>
+                <w:szCs w:val="20"/>
+              </w:rPr>
+            </w:pPr>
+            <w:r>
+              <w:rPr>
+                <w:rFonts w:ascii="Times" w:cs="Times" w:eastAsia="Times" w:hAnsi="Times"/>
+                <w:b w:val="1"/>
+                <w:bCs w:val="1"/>
                 <w:sz w:val="20"/>
                 <w:szCs w:val="20"/>
                 <w:rtl w:val="0"/>
@@ -4405,14 +4469,16 @@
               <w:rPr>
                 <w:rFonts w:ascii="Times" w:cs="Times" w:eastAsia="Times" w:hAnsi="Times"/>
                 <w:b w:val="1"/>
-                <w:sz w:val="20"/>
-                <w:szCs w:val="20"/>
-              </w:rPr>
-            </w:pPr>
-            <w:r>
-              <w:rPr>
-                <w:rFonts w:ascii="Times" w:cs="Times" w:eastAsia="Times" w:hAnsi="Times"/>
-                <w:b w:val="1"/>
+                <w:bCs w:val="1"/>
+                <w:sz w:val="20"/>
+                <w:szCs w:val="20"/>
+              </w:rPr>
+            </w:pPr>
+            <w:r>
+              <w:rPr>
+                <w:rFonts w:ascii="Times" w:cs="Times" w:eastAsia="Times" w:hAnsi="Times"/>
+                <w:b w:val="1"/>
+                <w:bCs w:val="1"/>
                 <w:sz w:val="20"/>
                 <w:szCs w:val="20"/>
                 <w:rtl w:val="0"/>
@@ -4442,14 +4508,16 @@
               <w:rPr>
                 <w:rFonts w:ascii="Times" w:cs="Times" w:eastAsia="Times" w:hAnsi="Times"/>
                 <w:b w:val="1"/>
-                <w:sz w:val="20"/>
-                <w:szCs w:val="20"/>
-              </w:rPr>
-            </w:pPr>
-            <w:r>
-              <w:rPr>
-                <w:rFonts w:ascii="Times" w:cs="Times" w:eastAsia="Times" w:hAnsi="Times"/>
-                <w:b w:val="1"/>
+                <w:bCs w:val="1"/>
+                <w:sz w:val="20"/>
+                <w:szCs w:val="20"/>
+              </w:rPr>
+            </w:pPr>
+            <w:r>
+              <w:rPr>
+                <w:rFonts w:ascii="Times" w:cs="Times" w:eastAsia="Times" w:hAnsi="Times"/>
+                <w:b w:val="1"/>
+                <w:bCs w:val="1"/>
                 <w:sz w:val="20"/>
                 <w:szCs w:val="20"/>
                 <w:rtl w:val="0"/>
@@ -4479,14 +4547,16 @@
               <w:rPr>
                 <w:rFonts w:ascii="Times" w:cs="Times" w:eastAsia="Times" w:hAnsi="Times"/>
                 <w:b w:val="1"/>
-                <w:sz w:val="20"/>
-                <w:szCs w:val="20"/>
-              </w:rPr>
-            </w:pPr>
-            <w:r>
-              <w:rPr>
-                <w:rFonts w:ascii="Times" w:cs="Times" w:eastAsia="Times" w:hAnsi="Times"/>
-                <w:b w:val="1"/>
+                <w:bCs w:val="1"/>
+                <w:sz w:val="20"/>
+                <w:szCs w:val="20"/>
+              </w:rPr>
+            </w:pPr>
+            <w:r>
+              <w:rPr>
+                <w:rFonts w:ascii="Times" w:cs="Times" w:eastAsia="Times" w:hAnsi="Times"/>
+                <w:b w:val="1"/>
+                <w:bCs w:val="1"/>
                 <w:sz w:val="20"/>
                 <w:szCs w:val="20"/>
                 <w:rtl w:val="0"/>
@@ -5118,6 +5188,7 @@
         <w:rPr>
           <w:rFonts w:ascii="Times" w:cs="Times" w:eastAsia="Times" w:hAnsi="Times"/>
           <w:b w:val="1"/>
+          <w:bCs w:val="1"/>
           <w:sz w:val="20"/>
           <w:szCs w:val="20"/>
           <w:rtl w:val="0"/>
@@ -5188,14 +5259,16 @@
               <w:rPr>
                 <w:rFonts w:ascii="Times" w:cs="Times" w:eastAsia="Times" w:hAnsi="Times"/>
                 <w:b w:val="1"/>
-                <w:sz w:val="20"/>
-                <w:szCs w:val="20"/>
-              </w:rPr>
-            </w:pPr>
-            <w:r>
-              <w:rPr>
-                <w:rFonts w:ascii="Times" w:cs="Times" w:eastAsia="Times" w:hAnsi="Times"/>
-                <w:b w:val="1"/>
+                <w:bCs w:val="1"/>
+                <w:sz w:val="20"/>
+                <w:szCs w:val="20"/>
+              </w:rPr>
+            </w:pPr>
+            <w:r>
+              <w:rPr>
+                <w:rFonts w:ascii="Times" w:cs="Times" w:eastAsia="Times" w:hAnsi="Times"/>
+                <w:b w:val="1"/>
+                <w:bCs w:val="1"/>
                 <w:sz w:val="20"/>
                 <w:szCs w:val="20"/>
                 <w:rtl w:val="0"/>
@@ -5215,6 +5288,7 @@
               <w:rPr>
                 <w:rFonts w:ascii="Times" w:cs="Times" w:eastAsia="Times" w:hAnsi="Times"/>
                 <w:b w:val="1"/>
+                <w:bCs w:val="1"/>
                 <w:sz w:val="20"/>
                 <w:szCs w:val="20"/>
                 <w:rtl w:val="0"/>
@@ -5232,33 +5306,35 @@
               <w:rPr>
                 <w:rFonts w:ascii="Times" w:cs="Times" w:eastAsia="Times" w:hAnsi="Times"/>
                 <w:b w:val="1"/>
-                <w:sz w:val="20"/>
-                <w:szCs w:val="20"/>
-              </w:rPr>
-            </w:pPr>
-            <w:r>
-              <w:rPr>
-                <w:rtl w:val="0"/>
-              </w:rPr>
-            </w:r>
-          </w:p>
-          <w:p>
-            <w:pPr>
-              <w:pageBreakBefore w:val="0"/>
-              <w:widowControl w:val="0"/>
-              <w:spacing w:line="240" w:lineRule="auto"/>
-              <w:ind w:firstLine="0"/>
-              <w:jc w:val="left"/>
-              <w:rPr>
-                <w:rFonts w:ascii="Times" w:cs="Times" w:eastAsia="Times" w:hAnsi="Times"/>
-                <w:sz w:val="20"/>
-                <w:szCs w:val="20"/>
-              </w:rPr>
-            </w:pPr>
-            <w:r>
-              <w:rPr>
-                <w:rFonts w:ascii="Times" w:cs="Times" w:eastAsia="Times" w:hAnsi="Times"/>
-                <w:b w:val="1"/>
+                <w:bCs w:val="1"/>
+                <w:sz w:val="20"/>
+                <w:szCs w:val="20"/>
+              </w:rPr>
+            </w:pPr>
+            <w:r>
+              <w:rPr>
+                <w:rtl w:val="0"/>
+              </w:rPr>
+            </w:r>
+          </w:p>
+          <w:p>
+            <w:pPr>
+              <w:pageBreakBefore w:val="0"/>
+              <w:widowControl w:val="0"/>
+              <w:spacing w:line="240" w:lineRule="auto"/>
+              <w:ind w:firstLine="0"/>
+              <w:jc w:val="left"/>
+              <w:rPr>
+                <w:rFonts w:ascii="Times" w:cs="Times" w:eastAsia="Times" w:hAnsi="Times"/>
+                <w:sz w:val="20"/>
+                <w:szCs w:val="20"/>
+              </w:rPr>
+            </w:pPr>
+            <w:r>
+              <w:rPr>
+                <w:rFonts w:ascii="Times" w:cs="Times" w:eastAsia="Times" w:hAnsi="Times"/>
+                <w:b w:val="1"/>
+                <w:bCs w:val="1"/>
                 <w:sz w:val="20"/>
                 <w:szCs w:val="20"/>
                 <w:rtl w:val="0"/>
@@ -5285,33 +5361,35 @@
               <w:rPr>
                 <w:rFonts w:ascii="Times" w:cs="Times" w:eastAsia="Times" w:hAnsi="Times"/>
                 <w:b w:val="1"/>
-                <w:sz w:val="20"/>
-                <w:szCs w:val="20"/>
-              </w:rPr>
-            </w:pPr>
-            <w:r>
-              <w:rPr>
-                <w:rtl w:val="0"/>
-              </w:rPr>
-            </w:r>
-          </w:p>
-          <w:p>
-            <w:pPr>
-              <w:pageBreakBefore w:val="0"/>
-              <w:widowControl w:val="0"/>
-              <w:spacing w:line="240" w:lineRule="auto"/>
-              <w:ind w:firstLine="0"/>
-              <w:jc w:val="left"/>
-              <w:rPr>
-                <w:rFonts w:ascii="Times" w:cs="Times" w:eastAsia="Times" w:hAnsi="Times"/>
-                <w:sz w:val="20"/>
-                <w:szCs w:val="20"/>
-              </w:rPr>
-            </w:pPr>
-            <w:r>
-              <w:rPr>
-                <w:rFonts w:ascii="Times" w:cs="Times" w:eastAsia="Times" w:hAnsi="Times"/>
-                <w:b w:val="1"/>
+                <w:bCs w:val="1"/>
+                <w:sz w:val="20"/>
+                <w:szCs w:val="20"/>
+              </w:rPr>
+            </w:pPr>
+            <w:r>
+              <w:rPr>
+                <w:rtl w:val="0"/>
+              </w:rPr>
+            </w:r>
+          </w:p>
+          <w:p>
+            <w:pPr>
+              <w:pageBreakBefore w:val="0"/>
+              <w:widowControl w:val="0"/>
+              <w:spacing w:line="240" w:lineRule="auto"/>
+              <w:ind w:firstLine="0"/>
+              <w:jc w:val="left"/>
+              <w:rPr>
+                <w:rFonts w:ascii="Times" w:cs="Times" w:eastAsia="Times" w:hAnsi="Times"/>
+                <w:sz w:val="20"/>
+                <w:szCs w:val="20"/>
+              </w:rPr>
+            </w:pPr>
+            <w:r>
+              <w:rPr>
+                <w:rFonts w:ascii="Times" w:cs="Times" w:eastAsia="Times" w:hAnsi="Times"/>
+                <w:b w:val="1"/>
+                <w:bCs w:val="1"/>
                 <w:sz w:val="20"/>
                 <w:szCs w:val="20"/>
                 <w:rtl w:val="0"/>
@@ -5338,34 +5416,37 @@
               <w:rPr>
                 <w:rFonts w:ascii="Times" w:cs="Times" w:eastAsia="Times" w:hAnsi="Times"/>
                 <w:b w:val="1"/>
-                <w:sz w:val="20"/>
-                <w:szCs w:val="20"/>
-              </w:rPr>
-            </w:pPr>
-            <w:r>
-              <w:rPr>
-                <w:rtl w:val="0"/>
-              </w:rPr>
-            </w:r>
-          </w:p>
-          <w:p>
-            <w:pPr>
-              <w:pageBreakBefore w:val="0"/>
-              <w:widowControl w:val="0"/>
-              <w:spacing w:line="240" w:lineRule="auto"/>
-              <w:ind w:firstLine="0"/>
-              <w:jc w:val="left"/>
-              <w:rPr>
-                <w:rFonts w:ascii="Times" w:cs="Times" w:eastAsia="Times" w:hAnsi="Times"/>
-                <w:b w:val="1"/>
-                <w:sz w:val="20"/>
-                <w:szCs w:val="20"/>
-              </w:rPr>
-            </w:pPr>
-            <w:r>
-              <w:rPr>
-                <w:rFonts w:ascii="Times" w:cs="Times" w:eastAsia="Times" w:hAnsi="Times"/>
-                <w:b w:val="1"/>
+                <w:bCs w:val="1"/>
+                <w:sz w:val="20"/>
+                <w:szCs w:val="20"/>
+              </w:rPr>
+            </w:pPr>
+            <w:r>
+              <w:rPr>
+                <w:rtl w:val="0"/>
+              </w:rPr>
+            </w:r>
+          </w:p>
+          <w:p>
+            <w:pPr>
+              <w:pageBreakBefore w:val="0"/>
+              <w:widowControl w:val="0"/>
+              <w:spacing w:line="240" w:lineRule="auto"/>
+              <w:ind w:firstLine="0"/>
+              <w:jc w:val="left"/>
+              <w:rPr>
+                <w:rFonts w:ascii="Times" w:cs="Times" w:eastAsia="Times" w:hAnsi="Times"/>
+                <w:b w:val="1"/>
+                <w:bCs w:val="1"/>
+                <w:sz w:val="20"/>
+                <w:szCs w:val="20"/>
+              </w:rPr>
+            </w:pPr>
+            <w:r>
+              <w:rPr>
+                <w:rFonts w:ascii="Times" w:cs="Times" w:eastAsia="Times" w:hAnsi="Times"/>
+                <w:b w:val="1"/>
+                <w:bCs w:val="1"/>
                 <w:sz w:val="20"/>
                 <w:szCs w:val="20"/>
                 <w:rtl w:val="0"/>
@@ -5410,6 +5491,7 @@
         <w:rPr>
           <w:rFonts w:ascii="Times" w:cs="Times" w:eastAsia="Times" w:hAnsi="Times"/>
           <w:b w:val="1"/>
+          <w:bCs w:val="1"/>
           <w:sz w:val="20"/>
           <w:szCs w:val="20"/>
           <w:rtl w:val="0"/>
@@ -5512,6 +5594,7 @@
         <w:rPr>
           <w:rFonts w:ascii="Times" w:cs="Times" w:eastAsia="Times" w:hAnsi="Times"/>
           <w:b w:val="1"/>
+          <w:bCs w:val="1"/>
           <w:sz w:val="20"/>
           <w:szCs w:val="20"/>
           <w:rtl w:val="0"/>
@@ -6022,14 +6105,16 @@
               <w:rPr>
                 <w:rFonts w:ascii="Times" w:cs="Times" w:eastAsia="Times" w:hAnsi="Times"/>
                 <w:b w:val="1"/>
-                <w:sz w:val="20"/>
-                <w:szCs w:val="20"/>
-              </w:rPr>
-            </w:pPr>
-            <w:r>
-              <w:rPr>
-                <w:rFonts w:ascii="Times" w:cs="Times" w:eastAsia="Times" w:hAnsi="Times"/>
-                <w:b w:val="1"/>
+                <w:bCs w:val="1"/>
+                <w:sz w:val="20"/>
+                <w:szCs w:val="20"/>
+              </w:rPr>
+            </w:pPr>
+            <w:r>
+              <w:rPr>
+                <w:rFonts w:ascii="Times" w:cs="Times" w:eastAsia="Times" w:hAnsi="Times"/>
+                <w:b w:val="1"/>
+                <w:bCs w:val="1"/>
                 <w:rtl w:val="0"/>
               </w:rPr>
               <w:t xml:space="preserve">DADOS PARA SOLICITAÇÃO DE BOLSA</w:t>
@@ -6038,6 +6123,7 @@
               <w:rPr>
                 <w:rFonts w:ascii="Times" w:cs="Times" w:eastAsia="Times" w:hAnsi="Times"/>
                 <w:b w:val="1"/>
+                <w:bCs w:val="1"/>
                 <w:sz w:val="20"/>
                 <w:szCs w:val="20"/>
                 <w:rtl w:val="0"/>
@@ -6075,14 +6161,16 @@
               <w:rPr>
                 <w:rFonts w:ascii="Times" w:cs="Times" w:eastAsia="Times" w:hAnsi="Times"/>
                 <w:b w:val="1"/>
-                <w:sz w:val="20"/>
-                <w:szCs w:val="20"/>
-              </w:rPr>
-            </w:pPr>
-            <w:r>
-              <w:rPr>
-                <w:rFonts w:ascii="Times" w:cs="Times" w:eastAsia="Times" w:hAnsi="Times"/>
-                <w:b w:val="1"/>
+                <w:bCs w:val="1"/>
+                <w:sz w:val="20"/>
+                <w:szCs w:val="20"/>
+              </w:rPr>
+            </w:pPr>
+            <w:r>
+              <w:rPr>
+                <w:rFonts w:ascii="Times" w:cs="Times" w:eastAsia="Times" w:hAnsi="Times"/>
+                <w:b w:val="1"/>
+                <w:bCs w:val="1"/>
                 <w:sz w:val="20"/>
                 <w:szCs w:val="20"/>
                 <w:rtl w:val="0"/>
@@ -6127,6 +6215,7 @@
               <w:rPr>
                 <w:rFonts w:ascii="Times" w:cs="Times" w:eastAsia="Times" w:hAnsi="Times"/>
                 <w:b w:val="1"/>
+                <w:bCs w:val="1"/>
                 <w:sz w:val="20"/>
                 <w:szCs w:val="20"/>
                 <w:rtl w:val="0"/>
@@ -6179,6 +6268,7 @@
               <w:rPr>
                 <w:rFonts w:ascii="Times" w:cs="Times" w:eastAsia="Times" w:hAnsi="Times"/>
                 <w:b w:val="1"/>
+                <w:bCs w:val="1"/>
                 <w:sz w:val="20"/>
                 <w:szCs w:val="20"/>
                 <w:rtl w:val="0"/>
@@ -6224,6 +6314,7 @@
               <w:rPr>
                 <w:rFonts w:ascii="Times" w:cs="Times" w:eastAsia="Times" w:hAnsi="Times"/>
                 <w:b w:val="1"/>
+                <w:bCs w:val="1"/>
                 <w:sz w:val="20"/>
                 <w:szCs w:val="20"/>
                 <w:rtl w:val="0"/>
@@ -6274,6 +6365,7 @@
               <w:rPr>
                 <w:rFonts w:ascii="Times" w:cs="Times" w:eastAsia="Times" w:hAnsi="Times"/>
                 <w:b w:val="1"/>
+                <w:bCs w:val="1"/>
                 <w:sz w:val="20"/>
                 <w:szCs w:val="20"/>
                 <w:rtl w:val="0"/>
@@ -6334,14 +6426,16 @@
               <w:rPr>
                 <w:rFonts w:ascii="Times" w:cs="Times" w:eastAsia="Times" w:hAnsi="Times"/>
                 <w:b w:val="1"/>
-                <w:sz w:val="20"/>
-                <w:szCs w:val="20"/>
-              </w:rPr>
-            </w:pPr>
-            <w:r>
-              <w:rPr>
-                <w:rFonts w:ascii="Times" w:cs="Times" w:eastAsia="Times" w:hAnsi="Times"/>
-                <w:b w:val="1"/>
+                <w:bCs w:val="1"/>
+                <w:sz w:val="20"/>
+                <w:szCs w:val="20"/>
+              </w:rPr>
+            </w:pPr>
+            <w:r>
+              <w:rPr>
+                <w:rFonts w:ascii="Times" w:cs="Times" w:eastAsia="Times" w:hAnsi="Times"/>
+                <w:b w:val="1"/>
+                <w:bCs w:val="1"/>
                 <w:sz w:val="20"/>
                 <w:szCs w:val="20"/>
                 <w:rtl w:val="0"/>
@@ -6385,6 +6479,7 @@
               <w:rPr>
                 <w:rFonts w:ascii="Times" w:cs="Times" w:eastAsia="Times" w:hAnsi="Times"/>
                 <w:b w:val="1"/>
+                <w:bCs w:val="1"/>
                 <w:sz w:val="20"/>
                 <w:szCs w:val="20"/>
                 <w:rtl w:val="0"/>
@@ -6430,6 +6525,7 @@
               <w:rPr>
                 <w:rFonts w:ascii="Times" w:cs="Times" w:eastAsia="Times" w:hAnsi="Times"/>
                 <w:b w:val="1"/>
+                <w:bCs w:val="1"/>
                 <w:sz w:val="20"/>
                 <w:szCs w:val="20"/>
                 <w:rtl w:val="0"/>
@@ -6475,6 +6571,7 @@
               <w:rPr>
                 <w:rFonts w:ascii="Times" w:cs="Times" w:eastAsia="Times" w:hAnsi="Times"/>
                 <w:b w:val="1"/>
+                <w:bCs w:val="1"/>
                 <w:sz w:val="20"/>
                 <w:szCs w:val="20"/>
                 <w:rtl w:val="0"/>
@@ -6520,6 +6617,7 @@
         <w:rPr>
           <w:rFonts w:ascii="Times" w:cs="Times" w:eastAsia="Times" w:hAnsi="Times"/>
           <w:b w:val="1"/>
+          <w:bCs w:val="1"/>
           <w:sz w:val="20"/>
           <w:szCs w:val="20"/>
         </w:rPr>
@@ -6530,6 +6628,7 @@
         <w:rPr>
           <w:rFonts w:ascii="Times" w:cs="Times" w:eastAsia="Times" w:hAnsi="Times"/>
           <w:b w:val="1"/>
+          <w:bCs w:val="1"/>
           <w:sz w:val="20"/>
           <w:szCs w:val="20"/>
           <w:rtl w:val="0"/>
@@ -6545,6 +6644,7 @@
         <w:rPr>
           <w:rFonts w:ascii="Times" w:cs="Times" w:eastAsia="Times" w:hAnsi="Times"/>
           <w:b w:val="1"/>
+          <w:bCs w:val="1"/>
           <w:sz w:val="20"/>
           <w:szCs w:val="20"/>
         </w:rPr>
@@ -6555,6 +6655,7 @@
         <w:rPr>
           <w:rFonts w:ascii="Times" w:cs="Times" w:eastAsia="Times" w:hAnsi="Times"/>
           <w:b w:val="1"/>
+          <w:bCs w:val="1"/>
           <w:sz w:val="20"/>
           <w:szCs w:val="20"/>
           <w:rtl w:val="0"/>
@@ -7096,6 +7197,7 @@
             <w:r>
               <w:rPr>
                 <w:b w:val="1"/>
+                <w:bCs w:val="1"/>
                 <w:rtl w:val="0"/>
               </w:rPr>
               <w:t xml:space="preserve">Nome:</w:t>
@@ -7132,6 +7234,7 @@
             <w:r>
               <w:rPr>
                 <w:b w:val="1"/>
+                <w:bCs w:val="1"/>
                 <w:rtl w:val="0"/>
               </w:rPr>
               <w:t xml:space="preserve">Data:</w:t>
@@ -7265,11 +7368,13 @@
               <w:jc w:val="left"/>
               <w:rPr>
                 <w:b w:val="1"/>
-              </w:rPr>
-            </w:pPr>
-            <w:r>
-              <w:rPr>
-                <w:b w:val="1"/>
+                <w:bCs w:val="1"/>
+              </w:rPr>
+            </w:pPr>
+            <w:r>
+              <w:rPr>
+                <w:b w:val="1"/>
+                <w:bCs w:val="1"/>
                 <w:rtl w:val="0"/>
               </w:rPr>
               <w:t xml:space="preserve">Assinatura e identificação do atendente:</w:t>
@@ -7431,11 +7536,13 @@
               <w:jc w:val="left"/>
               <w:rPr>
                 <w:b w:val="1"/>
-              </w:rPr>
-            </w:pPr>
-            <w:r>
-              <w:rPr>
-                <w:b w:val="1"/>
+                <w:bCs w:val="1"/>
+              </w:rPr>
+            </w:pPr>
+            <w:r>
+              <w:rPr>
+                <w:b w:val="1"/>
+                <w:bCs w:val="1"/>
                 <w:rtl w:val="0"/>
               </w:rPr>
               <w:t xml:space="preserve">Carimbo de recebimento:</w:t>
@@ -7470,6 +7577,7 @@
               <w:jc w:val="center"/>
               <w:rPr>
                 <w:b w:val="1"/>
+                <w:bCs w:val="1"/>
               </w:rPr>
             </w:pPr>
             <w:r>
@@ -7981,6 +8089,7 @@
       <w:jc w:val="center"/>
       <w:rPr>
         <w:b w:val="1"/>
+        <w:bCs w:val="1"/>
         <w:sz w:val="36"/>
         <w:szCs w:val="36"/>
       </w:rPr>
@@ -7990,6 +8099,7 @@
     <w:r>
       <w:rPr>
         <w:b w:val="1"/>
+        <w:bCs w:val="1"/>
         <w:sz w:val="36"/>
         <w:szCs w:val="36"/>
         <w:rtl w:val="0"/>
@@ -8016,6 +8126,7 @@
       <w:jc w:val="center"/>
       <w:rPr>
         <w:b w:val="1"/>
+        <w:bCs w:val="1"/>
         <w:sz w:val="32"/>
         <w:szCs w:val="32"/>
       </w:rPr>
@@ -8025,6 +8136,7 @@
     <w:r>
       <w:rPr>
         <w:b w:val="1"/>
+        <w:bCs w:val="1"/>
         <w:sz w:val="32"/>
         <w:szCs w:val="32"/>
         <w:rtl w:val="0"/>
@@ -8051,6 +8163,7 @@
       <w:jc w:val="center"/>
       <w:rPr>
         <w:b w:val="1"/>
+        <w:bCs w:val="1"/>
         <w:sz w:val="28"/>
         <w:szCs w:val="28"/>
       </w:rPr>
@@ -8060,6 +8173,7 @@
     <w:r>
       <w:rPr>
         <w:b w:val="1"/>
+        <w:bCs w:val="1"/>
         <w:sz w:val="28"/>
         <w:szCs w:val="28"/>
         <w:rtl w:val="0"/>
@@ -8135,7 +8249,9 @@
     <w:rPr>
       <w:rFonts w:ascii="Times New Roman" w:cs="Times New Roman" w:eastAsia="Times New Roman" w:hAnsi="Times New Roman"/>
       <w:b w:val="1"/>
+      <w:bCs w:val="1"/>
       <w:i w:val="0"/>
+      <w:iCs w:val="0"/>
       <w:smallCaps w:val="0"/>
       <w:strike w:val="0"/>
       <w:color w:val="000000"/>
@@ -8170,7 +8286,9 @@
     <w:rPr>
       <w:rFonts w:ascii="Times New Roman" w:cs="Times New Roman" w:eastAsia="Times New Roman" w:hAnsi="Times New Roman"/>
       <w:b w:val="0"/>
+      <w:bCs w:val="0"/>
       <w:i w:val="0"/>
+      <w:iCs w:val="0"/>
       <w:smallCaps w:val="0"/>
       <w:strike w:val="0"/>
       <w:color w:val="000000"/>
@@ -8205,7 +8323,9 @@
     <w:rPr>
       <w:rFonts w:ascii="Times New Roman" w:cs="Times New Roman" w:eastAsia="Times New Roman" w:hAnsi="Times New Roman"/>
       <w:b w:val="0"/>
+      <w:bCs w:val="0"/>
       <w:i w:val="0"/>
+      <w:iCs w:val="0"/>
       <w:smallCaps w:val="0"/>
       <w:strike w:val="0"/>
       <w:color w:val="000000"/>
@@ -8240,7 +8360,9 @@
     <w:rPr>
       <w:rFonts w:ascii="Times New Roman" w:cs="Times New Roman" w:eastAsia="Times New Roman" w:hAnsi="Times New Roman"/>
       <w:b w:val="0"/>
+      <w:bCs w:val="0"/>
       <w:i w:val="0"/>
+      <w:iCs w:val="0"/>
       <w:smallCaps w:val="0"/>
       <w:strike w:val="0"/>
       <w:color w:val="666666"/>
@@ -8275,7 +8397,9 @@
     <w:rPr>
       <w:rFonts w:ascii="Times New Roman" w:cs="Times New Roman" w:eastAsia="Times New Roman" w:hAnsi="Times New Roman"/>
       <w:b w:val="0"/>
+      <w:bCs w:val="0"/>
       <w:i w:val="0"/>
+      <w:iCs w:val="0"/>
       <w:smallCaps w:val="0"/>
       <w:strike w:val="0"/>
       <w:color w:val="666666"/>
@@ -8310,7 +8434,9 @@
     <w:rPr>
       <w:rFonts w:ascii="Times New Roman" w:cs="Times New Roman" w:eastAsia="Times New Roman" w:hAnsi="Times New Roman"/>
       <w:b w:val="0"/>
+      <w:bCs w:val="0"/>
       <w:i w:val="1"/>
+      <w:iCs w:val="1"/>
       <w:smallCaps w:val="0"/>
       <w:strike w:val="0"/>
       <w:color w:val="666666"/>
@@ -8345,7 +8471,9 @@
     <w:rPr>
       <w:rFonts w:ascii="Times New Roman" w:cs="Times New Roman" w:eastAsia="Times New Roman" w:hAnsi="Times New Roman"/>
       <w:b w:val="1"/>
+      <w:bCs w:val="1"/>
       <w:i w:val="0"/>
+      <w:iCs w:val="0"/>
       <w:smallCaps w:val="0"/>
       <w:strike w:val="0"/>
       <w:color w:val="000000"/>
@@ -8380,7 +8508,9 @@
     <w:rPr>
       <w:rFonts w:ascii="Arial" w:cs="Arial" w:eastAsia="Arial" w:hAnsi="Arial"/>
       <w:b w:val="0"/>
+      <w:bCs w:val="0"/>
       <w:i w:val="0"/>
+      <w:iCs w:val="0"/>
       <w:smallCaps w:val="0"/>
       <w:strike w:val="0"/>
       <w:color w:val="666666"/>

</xml_diff>